<commit_message>
refactor: extract calendar provider abstraction for multi-provider support
Introduces ICalendarProvider interface with Google implementation, factory
pattern, and microsoftCalendar field on User model — preparing for Office 365
integration. Fixes hub notification links from dead /coaching/bookings to
valid /booking (coach) and /coaching/:engagementId (coachee) routes. Updates
all 8 test suites to mock @googleapis/calendar instead of legacy googleapis.

Co-Authored-By: Claude Opus 4.6 (1M context) <noreply@anthropic.com>
</commit_message>
<xml_diff>
--- a/docs/design/coaching_module.docx
+++ b/docs/design/coaching_module.docx
@@ -429,6 +429,7 @@
         <w:spacing w:after="40"/>
       </w:pPr>
       <w:r>
+        <w:lastRenderedPageBreak/>
         <w:t>15. Outstanding Work &amp; Roadmap Gaps</w:t>
       </w:r>
     </w:p>
@@ -13126,7 +13127,6 @@
       </w:r>
     </w:p>
     <w:p>
-      <w:pPr/>
       <w:r>
         <w:t>The Coaching Module has been implemented iteratively over several release cycles. This section records what is live in production as of April 2026, so this document serves as both specification and state-of-build reference. Sections 3 through 12 describe the designed behaviour; the sub-sections below note which of those items are fully delivered, which are partial, and which are still outstanding.</w:t>
       </w:r>
@@ -13176,7 +13176,11 @@
         <w:pStyle w:val="ListBullet"/>
       </w:pPr>
       <w:r>
-        <w:t>JournalSessionNote: split ownership - preSession / inSession / postSession fields are coach-owned; coacheePre (moodRating 1-5 stars, topOfMind, mainTopic, valueDefinition, recentShifts, contextForCoach) and coacheePost (biggestInsight, whatShifted, three commitments, followThroughConfidence 1-10, sessionRating 1-5, exploreNext, feedbackForCoach) are coachee-owned.</w:t>
+        <w:t xml:space="preserve">JournalSessionNote: split ownership - preSession / inSession / postSession fields are coach-owned; coacheePre (moodRating 1-5 stars, topOfMind, mainTopic, valueDefinition, recentShifts, </w:t>
+      </w:r>
+      <w:r>
+        <w:lastRenderedPageBreak/>
+        <w:t>contextForCoach) and coacheePost (biggestInsight, whatShifted, three commitments, followThroughConfidence 1-10, sessionRating 1-5, exploreNext, feedbackForCoach) are coachee-owned.</w:t>
       </w:r>
     </w:p>
     <w:p>
@@ -13320,6 +13324,7 @@
         <w:pStyle w:val="Heading2"/>
       </w:pPr>
       <w:r>
+        <w:lastRenderedPageBreak/>
         <w:t>14.4 Booking &lt;-&gt; Coaching Integration (Live)</w:t>
       </w:r>
     </w:p>
@@ -13488,6 +13493,7 @@
         <w:pStyle w:val="ListBullet"/>
       </w:pPr>
       <w:r>
+        <w:lastRenderedPageBreak/>
         <w:t>System-admin per-org trial feature: snapshot current plan / modules / maxUsers, apply trial values, auto-revert via nightly 02:15 cron. Org-settings page surfaces trial-granted modules that sit outside the base plan so the org admin can still toggle them.</w:t>
       </w:r>
     </w:p>
@@ -13549,6 +13555,24 @@
     </w:p>
     <w:p>
       <w:pPr>
+        <w:spacing w:after="200"/>
+      </w:pPr>
+      <w:r>
+        <w:br w:type="page"/>
+      </w:r>
+    </w:p>
+    <w:p>
+      <w:pPr>
+        <w:pStyle w:val="ListBullet"/>
+        <w:numPr>
+          <w:ilvl w:val="0"/>
+          <w:numId w:val="0"/>
+        </w:numPr>
+        <w:ind w:left="360"/>
+      </w:pPr>
+    </w:p>
+    <w:p>
+      <w:pPr>
         <w:pStyle w:val="Heading1"/>
       </w:pPr>
       <w:r>
@@ -13556,7 +13580,6 @@
       </w:r>
     </w:p>
     <w:p>
-      <w:pPr/>
       <w:r>
         <w:t>The following items are designed in sections 3-12 of this document but not yet implemented. They are listed in rough priority order, grouped by theme.</w:t>
       </w:r>
@@ -13694,6 +13717,7 @@
         <w:pStyle w:val="ListBullet"/>
       </w:pPr>
       <w:r>
+        <w:lastRenderedPageBreak/>
         <w:t>AI coach session-prep brief: 60-second summary of prior notes, outstanding action items, check-in data for the upcoming session.</w:t>
       </w:r>
     </w:p>
@@ -13792,6 +13816,24 @@
       <w:r>
         <w:t>Coach branding: publicSlug and bio exist; a richer public-profile template (photo, testimonials, service list, book-now CTA) is outstanding.</w:t>
       </w:r>
+    </w:p>
+    <w:p>
+      <w:pPr>
+        <w:spacing w:after="200"/>
+      </w:pPr>
+      <w:r>
+        <w:br w:type="page"/>
+      </w:r>
+    </w:p>
+    <w:p>
+      <w:pPr>
+        <w:pStyle w:val="ListBullet"/>
+        <w:numPr>
+          <w:ilvl w:val="0"/>
+          <w:numId w:val="0"/>
+        </w:numPr>
+        <w:ind w:left="360"/>
+      </w:pPr>
     </w:p>
     <w:p>
       <w:pPr>

</xml_diff>

<commit_message>
docs: case-study seed runbook + coaching §15.1 assessments design
- caseStudies/README.md: add the "How to run when you're ready" section with
  the seed-divergence-case-studies.ts dry-run / --apply / per-case usage.
- coaching_15-1 and 15-2.md: new design doc covering the Assessments &
  Measurement work (generic AssessmentRecord, pre/post comparison on
  engagement detail, formal 360 flow on the survey engine).
- coaching_module.docx: minor edit.

Co-Authored-By: Claude Opus 4.7 (1M context) <noreply@anthropic.com>
</commit_message>
<xml_diff>
--- a/docs/design/coaching_module.docx
+++ b/docs/design/coaching_module.docx
@@ -13631,6 +13631,9 @@
       <w:r>
         <w:t>CoachingHoursLog: auto-populate from completed sessions (paid / pro bono, individual / team / group), manual entry for external clients, mentor-coaching hours received, CCE credit logging.</w:t>
       </w:r>
+      <w:r>
+        <w:t xml:space="preserve"> Add ability to import from csv/excel.</w:t>
+      </w:r>
     </w:p>
     <w:p>
       <w:pPr>
@@ -13645,7 +13648,13 @@
         <w:pStyle w:val="Heading2"/>
       </w:pPr>
       <w:r>
-        <w:t>15.3 Sponsor &amp; Engagement Reporting</w:t>
+        <w:t>15.</w:t>
+      </w:r>
+      <w:r>
+        <w:t>3</w:t>
+      </w:r>
+      <w:r>
+        <w:t xml:space="preserve"> Engagement Lifecycle Coverage</w:t>
       </w:r>
     </w:p>
     <w:p>
@@ -13653,6 +13662,55 @@
         <w:pStyle w:val="ListBullet"/>
       </w:pPr>
       <w:r>
+        <w:t>Chemistry call workflow distinct from paid sessions (complimentary, no quota consumption, prospect -&gt; contracted transition).</w:t>
+      </w:r>
+    </w:p>
+    <w:p>
+      <w:pPr>
+        <w:pStyle w:val="ListBullet"/>
+      </w:pPr>
+      <w:r>
+        <w:t>Contract upload and e-signature integration on the contracting phase.</w:t>
+      </w:r>
+      <w:r>
+        <w:t xml:space="preserve"> Remember there are 2 contracts: 1. Coaching agreement coach – coachee (relationship/rules) and 2. Coaching process contract coach – sponsor conditions</w:t>
+      </w:r>
+    </w:p>
+    <w:p>
+      <w:pPr>
+        <w:pStyle w:val="ListBullet"/>
+      </w:pPr>
+      <w:r>
+        <w:t>Mid-point and final three-way review scheduling and templates.</w:t>
+      </w:r>
+    </w:p>
+    <w:p>
+      <w:pPr>
+        <w:pStyle w:val="ListBullet"/>
+      </w:pPr>
+      <w:r>
+        <w:t>Alumni follow-up automation: 3-month / 6-month reminders, alumni read-only access to their IDP and session summaries, reactivation workflow.</w:t>
+      </w:r>
+    </w:p>
+    <w:p>
+      <w:pPr>
+        <w:pStyle w:val="Heading2"/>
+      </w:pPr>
+      <w:r>
+        <w:t>15.</w:t>
+      </w:r>
+      <w:r>
+        <w:t>4</w:t>
+      </w:r>
+      <w:r>
+        <w:t xml:space="preserve"> Sponsor &amp; Engagement Reporting</w:t>
+      </w:r>
+    </w:p>
+    <w:p>
+      <w:pPr>
+        <w:pStyle w:val="ListBullet"/>
+      </w:pPr>
+      <w:r>
         <w:t>AI-drafted sponsor progress report pulling from session data and milestone status, with granular coach review controls before sharing. Must guarantee private session content never leaks.</w:t>
       </w:r>
     </w:p>
@@ -13674,10 +13732,25 @@
     </w:p>
     <w:p>
       <w:pPr>
+        <w:pStyle w:val="Heading2"/>
+      </w:pPr>
+      <w:r>
+        <w:lastRenderedPageBreak/>
+        <w:t>15.</w:t>
+      </w:r>
+      <w:r>
+        <w:t>5</w:t>
+      </w:r>
+      <w:r>
+        <w:t xml:space="preserve"> Between-Session Engagement</w:t>
+      </w:r>
+    </w:p>
+    <w:p>
+      <w:pPr>
         <w:pStyle w:val="ListBullet"/>
       </w:pPr>
       <w:r>
-        <w:t>Optional sponsor portal with limited read-only access to pre-agreed metrics.</w:t>
+        <w:t>Dedicated ActionItem entity with Not-Started / In-Progress / Complete / Deferred lifecycle, overdue reminders, and a cross-engagement action board for the coach. Currently only accountability items on each journal note.</w:t>
       </w:r>
     </w:p>
     <w:p>
@@ -13685,7 +13758,7 @@
         <w:pStyle w:val="Heading2"/>
       </w:pPr>
       <w:r>
-        <w:t>15.4 Between-Session Engagement</w:t>
+        <w:t>15.6 Theory &amp; Framework Metadata</w:t>
       </w:r>
     </w:p>
     <w:p>
@@ -13693,7 +13766,15 @@
         <w:pStyle w:val="ListBullet"/>
       </w:pPr>
       <w:r>
-        <w:t>Check-in pulse micro-surveys (2-3 questions, configurable cadence) feeding into the coach session-prep brief.</w:t>
+        <w:t>ICF competency self-rating prompts on session notes.</w:t>
+      </w:r>
+    </w:p>
+    <w:p>
+      <w:pPr>
+        <w:pStyle w:val="Heading2"/>
+      </w:pPr>
+      <w:r>
+        <w:t>15.7 Practice Management Polish</w:t>
       </w:r>
     </w:p>
     <w:p>
@@ -13701,7 +13782,7 @@
         <w:pStyle w:val="ListBullet"/>
       </w:pPr>
       <w:r>
-        <w:t>AI-generated reflection prompts personalised to current goals and recent session content (beyond the static pre-session template).</w:t>
+        <w:t>Session package management: purchased vs used vs remaining with low-balance alerts (quota exists per engagement; package renewal workflow not yet built).</w:t>
       </w:r>
     </w:p>
     <w:p>
@@ -13709,7 +13790,7 @@
         <w:pStyle w:val="ListBullet"/>
       </w:pPr>
       <w:r>
-        <w:t>Dedicated ActionItem entity with Not-Started / In-Progress / Complete / Deferred lifecycle, overdue reminders, and a cross-engagement action board for the coach. Currently only accountability items on each journal note.</w:t>
+        <w:t>Practice-level dashboard: revenue this quarter, upcoming sessions calendar view across all engagements, "clients with no session in 3+ weeks" health indicator.</w:t>
       </w:r>
     </w:p>
     <w:p>
@@ -13717,106 +13798,28 @@
         <w:pStyle w:val="ListBullet"/>
       </w:pPr>
       <w:r>
+        <w:t>Coach branding: publicSlug and bio exist; a richer public-profile template (photo, testimonials, service list, book-now CTA) is outstanding.</w:t>
+      </w:r>
+    </w:p>
+    <w:p>
+      <w:pPr>
+        <w:spacing w:after="200"/>
+      </w:pPr>
+      <w:r>
+        <w:br w:type="page"/>
+      </w:r>
+    </w:p>
+    <w:p>
+      <w:pPr>
+        <w:pStyle w:val="Heading2"/>
+      </w:pPr>
+      <w:r>
         <w:lastRenderedPageBreak/>
-        <w:t>AI coach session-prep brief: 60-second summary of prior notes, outstanding action items, check-in data for the upcoming session.</w:t>
-      </w:r>
-    </w:p>
-    <w:p>
-      <w:pPr>
-        <w:pStyle w:val="Heading2"/>
-      </w:pPr>
-      <w:r>
-        <w:t>15.5 Engagement Lifecycle Coverage</w:t>
-      </w:r>
-    </w:p>
-    <w:p>
-      <w:pPr>
-        <w:pStyle w:val="ListBullet"/>
-      </w:pPr>
-      <w:r>
-        <w:t>Chemistry call workflow distinct from paid sessions (complimentary, no quota consumption, prospect -&gt; contracted transition).</w:t>
-      </w:r>
-    </w:p>
-    <w:p>
-      <w:pPr>
-        <w:pStyle w:val="ListBullet"/>
-      </w:pPr>
-      <w:r>
-        <w:t>Contract upload and e-signature integration on the contracting phase.</w:t>
-      </w:r>
-    </w:p>
-    <w:p>
-      <w:pPr>
-        <w:pStyle w:val="ListBullet"/>
-      </w:pPr>
-      <w:r>
-        <w:t>Mid-point and final three-way review scheduling and templates.</w:t>
-      </w:r>
-    </w:p>
-    <w:p>
-      <w:pPr>
-        <w:pStyle w:val="ListBullet"/>
-      </w:pPr>
-      <w:r>
-        <w:t>Alumni follow-up automation: 3-month / 6-month reminders, alumni read-only access to their IDP and session summaries, reactivation workflow.</w:t>
-      </w:r>
-    </w:p>
-    <w:p>
-      <w:pPr>
-        <w:pStyle w:val="Heading2"/>
-      </w:pPr>
-      <w:r>
-        <w:t>15.6 Theory &amp; Framework Metadata</w:t>
-      </w:r>
-    </w:p>
-    <w:p>
-      <w:pPr>
-        <w:pStyle w:val="ListBullet"/>
-      </w:pPr>
-      <w:r>
-        <w:t>Session framework tagging (GROW, CBT, positive psychology, solution-focused, narrative) as an aid for professional development reflection and ICF competency demonstration.</w:t>
-      </w:r>
-    </w:p>
-    <w:p>
-      <w:pPr>
-        <w:pStyle w:val="ListBullet"/>
-      </w:pPr>
-      <w:r>
-        <w:t>ICF competency self-rating prompts on session notes.</w:t>
-      </w:r>
-    </w:p>
-    <w:p>
-      <w:pPr>
-        <w:pStyle w:val="Heading2"/>
-      </w:pPr>
-      <w:r>
-        <w:t>15.7 Practice Management Polish</w:t>
-      </w:r>
-    </w:p>
-    <w:p>
-      <w:pPr>
-        <w:pStyle w:val="ListBullet"/>
-      </w:pPr>
-      <w:r>
-        <w:t>Session package management: purchased vs used vs remaining with low-balance alerts (quota exists per engagement; package renewal workflow not yet built).</w:t>
-      </w:r>
-    </w:p>
-    <w:p>
-      <w:pPr>
-        <w:pStyle w:val="ListBullet"/>
-      </w:pPr>
-      <w:r>
-        <w:t>Practice-level dashboard: revenue this quarter, upcoming sessions calendar view across all engagements, "clients with no session in 3+ weeks" health indicator.</w:t>
-      </w:r>
-    </w:p>
-    <w:p>
-      <w:pPr>
-        <w:pStyle w:val="ListBullet"/>
-      </w:pPr>
-      <w:r>
-        <w:t>Coach branding: publicSlug and bio exist; a richer public-profile template (photo, testimonials, service list, book-now CTA) is outstanding.</w:t>
-      </w:r>
-    </w:p>
+        <w:t>15.X – CLAUDE CODE PLAN</w:t>
+      </w:r>
+    </w:p>
+    <w:p/>
+    <w:p/>
     <w:p>
       <w:pPr>
         <w:spacing w:after="200"/>

</xml_diff>